<commit_message>
Fix RTL alignment in Raveh draft; document the RTL jc pitfall in guides
- Raveh draft had the same bug (jc=right on Hebrew body -> rendered left).
  Drop jc from Hebrew body paragraphs (RTL default = right); keep the two
  date lines left-aligned per the Stanovsky sample convention.
- Build guide: warn never to use jc=right on Hebrew body; explain the
  logical-end=physical-left interpretation; note LibreOffice render+measure
  is now the required layout-verification step; PYTHONUTF8=1 on Windows.
- Structure analysis: note the date is left-aligned, body right.

Co-Authored-By: Claude Opus 4.8 <noreply@anthropic.com>
</commit_message>
<xml_diff>
--- a/מכתבים/טיוטות/מכתב-דיקן-אישור-סוקרים-ברק-רווה-טיוטה.docx
+++ b/מכתבים/טיוטות/מכתב-דיקן-אישור-סוקרים-ברק-רווה-טיוטה.docx
@@ -62,7 +62,6 @@
       <w:pPr>
         <w:bidi/>
         <w:spacing w:before="100" w:beforeAutospacing="1" w:after="100" w:afterAutospacing="1" w:line="240" w:lineRule="auto"/>
-        <w:jc w:val="right"/>
         <w:rPr>
           <w:rFonts w:ascii="Times New Roman" w:eastAsia="Times New Roman" w:hAnsi="Times New Roman" w:cs="Times New Roman"/>
           <w:sz w:val="24"/>
@@ -84,7 +83,6 @@
       <w:pPr>
         <w:bidi/>
         <w:spacing w:before="100" w:beforeAutospacing="1" w:after="100" w:afterAutospacing="1" w:line="240" w:lineRule="auto"/>
-        <w:jc w:val="right"/>
         <w:rPr>
           <w:rFonts w:ascii="Times New Roman" w:eastAsia="Times New Roman" w:hAnsi="Times New Roman" w:cs="Times New Roman"/>
           <w:sz w:val="24"/>
@@ -106,7 +104,6 @@
       <w:pPr>
         <w:bidi/>
         <w:spacing w:before="100" w:beforeAutospacing="1" w:after="100" w:afterAutospacing="1" w:line="240" w:lineRule="auto"/>
-        <w:jc w:val="right"/>
         <w:rPr>
           <w:rFonts w:ascii="Times New Roman" w:eastAsia="Times New Roman" w:hAnsi="Times New Roman" w:cs="Times New Roman"/>
           <w:sz w:val="24"/>
@@ -140,7 +137,6 @@
       <w:pPr>
         <w:bidi/>
         <w:spacing w:before="100" w:beforeAutospacing="1" w:after="100" w:afterAutospacing="1" w:line="240" w:lineRule="auto"/>
-        <w:jc w:val="right"/>
         <w:rPr>
           <w:rFonts w:ascii="Times New Roman" w:eastAsia="Times New Roman" w:hAnsi="Times New Roman" w:cs="Times New Roman"/>
           <w:sz w:val="24"/>
@@ -176,7 +172,6 @@
       <w:pPr>
         <w:bidi/>
         <w:spacing w:before="100" w:beforeAutospacing="1" w:after="100" w:afterAutospacing="1" w:line="240" w:lineRule="auto"/>
-        <w:jc w:val="right"/>
         <w:rPr>
           <w:rFonts w:ascii="Times New Roman" w:eastAsia="Times New Roman" w:hAnsi="Times New Roman" w:cs="Times New Roman"/>
           <w:sz w:val="24"/>
@@ -198,7 +193,6 @@
       <w:pPr>
         <w:bidi/>
         <w:spacing w:before="100" w:beforeAutospacing="1" w:after="100" w:afterAutospacing="1" w:line="240" w:lineRule="auto"/>
-        <w:jc w:val="right"/>
         <w:rPr>
           <w:rFonts w:ascii="Times New Roman" w:eastAsia="Times New Roman" w:hAnsi="Times New Roman" w:cs="Times New Roman"/>
           <w:sz w:val="24"/>
@@ -220,7 +214,6 @@
       <w:pPr>
         <w:bidi/>
         <w:spacing w:before="100" w:beforeAutospacing="1" w:after="100" w:afterAutospacing="1" w:line="240" w:lineRule="auto"/>
-        <w:jc w:val="right"/>
         <w:rPr>
           <w:rFonts w:ascii="Times New Roman" w:eastAsia="Times New Roman" w:hAnsi="Times New Roman" w:cs="Times New Roman"/>
           <w:sz w:val="24"/>
@@ -242,7 +235,6 @@
       <w:pPr>
         <w:bidi/>
         <w:spacing w:before="100" w:beforeAutospacing="1" w:after="100" w:afterAutospacing="1" w:line="240" w:lineRule="auto"/>
-        <w:jc w:val="right"/>
         <w:rPr>
           <w:rFonts w:ascii="Times New Roman" w:eastAsia="Times New Roman" w:hAnsi="Times New Roman" w:cs="Times New Roman"/>
           <w:sz w:val="24"/>
@@ -764,7 +756,6 @@
       <w:pPr>
         <w:bidi/>
         <w:spacing w:before="100" w:beforeAutospacing="1" w:after="100" w:afterAutospacing="1" w:line="240" w:lineRule="auto"/>
-        <w:jc w:val="right"/>
         <w:rPr>
           <w:rFonts w:ascii="Times New Roman" w:eastAsia="Times New Roman" w:hAnsi="Times New Roman" w:cs="Times New Roman"/>
           <w:sz w:val="24"/>
@@ -798,7 +789,6 @@
       <w:pPr>
         <w:bidi/>
         <w:spacing w:before="100" w:beforeAutospacing="1" w:after="100" w:afterAutospacing="1" w:line="240" w:lineRule="auto"/>
-        <w:jc w:val="right"/>
         <w:rPr>
           <w:rFonts w:ascii="Times New Roman" w:eastAsia="Times New Roman" w:hAnsi="Times New Roman" w:cs="Times New Roman"/>
           <w:sz w:val="24"/>
@@ -820,7 +810,6 @@
       <w:pPr>
         <w:bidi/>
         <w:spacing w:before="100" w:beforeAutospacing="1" w:after="100" w:afterAutospacing="1" w:line="240" w:lineRule="auto"/>
-        <w:jc w:val="right"/>
         <w:rPr>
           <w:rFonts w:ascii="Times New Roman" w:eastAsia="Times New Roman" w:hAnsi="Times New Roman" w:cs="Times New Roman"/>
           <w:sz w:val="24"/>

</xml_diff>